<commit_message>
docs: archivo de profundización F-IR-01 terminado con evidencia de trabajo.
</commit_message>
<xml_diff>
--- a/01-requisitos/02-respuestas-formulario/02-Orozco-Adrian/F-IR-01-analisis-dev.docx
+++ b/01-requisitos/02-respuestas-formulario/02-Orozco-Adrian/F-IR-01-analisis-dev.docx
@@ -461,7 +461,7 @@
           <w:szCs w:val="26"/>
         </w:rPr>
         <w:drawing>
-          <wp:anchor distT="0" distB="0" distL="114300" distR="114300" simplePos="0" relativeHeight="251658240" behindDoc="1" locked="0" layoutInCell="1" allowOverlap="1">
+          <wp:anchor distT="0" distB="0" distL="114300" distR="114300" simplePos="0" relativeHeight="251658240" behindDoc="1" locked="0" layoutInCell="1" allowOverlap="1" wp14:anchorId="28B5F118" wp14:editId="66EEEBC6">
             <wp:simplePos x="0" y="0"/>
             <wp:positionH relativeFrom="margin">
               <wp:align>right</wp:align>
@@ -635,7 +635,7 @@
         </w:rPr>
         <w:lastRenderedPageBreak/>
         <w:drawing>
-          <wp:anchor distT="0" distB="0" distL="114300" distR="114300" simplePos="0" relativeHeight="251659264" behindDoc="1" locked="0" layoutInCell="1" allowOverlap="1">
+          <wp:anchor distT="0" distB="0" distL="114300" distR="114300" simplePos="0" relativeHeight="251659264" behindDoc="1" locked="0" layoutInCell="1" allowOverlap="1" wp14:anchorId="76D804C3" wp14:editId="583B9404">
             <wp:simplePos x="0" y="0"/>
             <wp:positionH relativeFrom="margin">
               <wp:align>right</wp:align>
@@ -988,15 +988,7 @@
           <w:sz w:val="26"/>
           <w:szCs w:val="26"/>
         </w:rPr>
-        <w:t>#</w:t>
-      </w:r>
-      <w:r>
-        <w:rPr>
-          <w:rFonts w:ascii="Arial" w:hAnsi="Arial" w:cs="Arial"/>
-          <w:sz w:val="26"/>
-          <w:szCs w:val="26"/>
-        </w:rPr>
-        <w:t>4F0E6C</w:t>
+        <w:t>#4F0E6C</w:t>
       </w:r>
     </w:p>
     <w:p>
@@ -1029,15 +1021,7 @@
           <w:sz w:val="26"/>
           <w:szCs w:val="26"/>
         </w:rPr>
-        <w:t>#</w:t>
-      </w:r>
-      <w:r>
-        <w:rPr>
-          <w:rFonts w:ascii="Arial" w:hAnsi="Arial" w:cs="Arial"/>
-          <w:sz w:val="26"/>
-          <w:szCs w:val="26"/>
-        </w:rPr>
-        <w:t>7A1BFF</w:t>
+        <w:t>#7A1BFF</w:t>
       </w:r>
     </w:p>
     <w:p>
@@ -1070,15 +1054,7 @@
           <w:sz w:val="26"/>
           <w:szCs w:val="26"/>
         </w:rPr>
-        <w:t>#</w:t>
-      </w:r>
-      <w:r>
-        <w:rPr>
-          <w:rFonts w:ascii="Arial" w:hAnsi="Arial" w:cs="Arial"/>
-          <w:sz w:val="26"/>
-          <w:szCs w:val="26"/>
-        </w:rPr>
-        <w:t>9C2CFF</w:t>
+        <w:t>#9C2CFF</w:t>
       </w:r>
     </w:p>
     <w:p>
@@ -1131,15 +1107,7 @@
           <w:sz w:val="26"/>
           <w:szCs w:val="26"/>
         </w:rPr>
-        <w:t>#</w:t>
-      </w:r>
-      <w:r>
-        <w:rPr>
-          <w:rFonts w:ascii="Arial" w:hAnsi="Arial" w:cs="Arial"/>
-          <w:sz w:val="26"/>
-          <w:szCs w:val="26"/>
-        </w:rPr>
-        <w:t>BF6CFD</w:t>
+        <w:t>#BF6CFD</w:t>
       </w:r>
     </w:p>
     <w:p>
@@ -1371,47 +1339,7 @@
           <w:sz w:val="26"/>
           <w:szCs w:val="26"/>
         </w:rPr>
-        <w:t>#</w:t>
-      </w:r>
-      <w:r>
-        <w:rPr>
-          <w:rFonts w:ascii="Arial" w:hAnsi="Arial" w:cs="Arial"/>
-          <w:sz w:val="26"/>
-          <w:szCs w:val="26"/>
-        </w:rPr>
-        <w:t>F</w:t>
-      </w:r>
-      <w:r>
-        <w:rPr>
-          <w:rFonts w:ascii="Arial" w:hAnsi="Arial" w:cs="Arial"/>
-          <w:sz w:val="26"/>
-          <w:szCs w:val="26"/>
-        </w:rPr>
-        <w:t>4</w:t>
-      </w:r>
-      <w:r>
-        <w:rPr>
-          <w:rFonts w:ascii="Arial" w:hAnsi="Arial" w:cs="Arial"/>
-          <w:sz w:val="26"/>
-          <w:szCs w:val="26"/>
-        </w:rPr>
-        <w:t>BE</w:t>
-      </w:r>
-      <w:r>
-        <w:rPr>
-          <w:rFonts w:ascii="Arial" w:hAnsi="Arial" w:cs="Arial"/>
-          <w:sz w:val="26"/>
-          <w:szCs w:val="26"/>
-        </w:rPr>
-        <w:t>4</w:t>
-      </w:r>
-      <w:r>
-        <w:rPr>
-          <w:rFonts w:ascii="Arial" w:hAnsi="Arial" w:cs="Arial"/>
-          <w:sz w:val="26"/>
-          <w:szCs w:val="26"/>
-        </w:rPr>
-        <w:t>F</w:t>
+        <w:t>#F4BE4F</w:t>
       </w:r>
     </w:p>
     <w:p>
@@ -1497,15 +1425,7 @@
           <w:sz w:val="26"/>
           <w:szCs w:val="26"/>
         </w:rPr>
-        <w:t>#</w:t>
-      </w:r>
-      <w:r>
-        <w:rPr>
-          <w:rFonts w:ascii="Arial" w:hAnsi="Arial" w:cs="Arial"/>
-          <w:sz w:val="26"/>
-          <w:szCs w:val="26"/>
-        </w:rPr>
-        <w:t>FECE4B</w:t>
+        <w:t>#FECE4B</w:t>
       </w:r>
     </w:p>
     <w:p>
@@ -1540,15 +1460,7 @@
           <w:sz w:val="26"/>
           <w:szCs w:val="26"/>
         </w:rPr>
-        <w:t>#</w:t>
-      </w:r>
-      <w:r>
-        <w:rPr>
-          <w:rFonts w:ascii="Arial" w:hAnsi="Arial" w:cs="Arial"/>
-          <w:sz w:val="26"/>
-          <w:szCs w:val="26"/>
-        </w:rPr>
-        <w:t>FCCC2C</w:t>
+        <w:t>#FCCC2C</w:t>
       </w:r>
     </w:p>
     <w:p>
@@ -1636,15 +1548,7 @@
           <w:sz w:val="26"/>
           <w:szCs w:val="26"/>
         </w:rPr>
-        <w:t>#</w:t>
-      </w:r>
-      <w:r>
-        <w:rPr>
-          <w:rFonts w:ascii="Arial" w:hAnsi="Arial" w:cs="Arial"/>
-          <w:sz w:val="26"/>
-          <w:szCs w:val="26"/>
-        </w:rPr>
-        <w:t>27A36B</w:t>
+        <w:t>#27A36B</w:t>
       </w:r>
     </w:p>
     <w:p>
@@ -1701,15 +1605,7 @@
           <w:sz w:val="26"/>
           <w:szCs w:val="26"/>
         </w:rPr>
-        <w:t>#</w:t>
-      </w:r>
-      <w:r>
-        <w:rPr>
-          <w:rFonts w:ascii="Arial" w:hAnsi="Arial" w:cs="Arial"/>
-          <w:sz w:val="26"/>
-          <w:szCs w:val="26"/>
-        </w:rPr>
-        <w:t>C93A5A</w:t>
+        <w:t>#C93A5A</w:t>
       </w:r>
     </w:p>
     <w:p>
@@ -1736,27 +1632,7 @@
           <w:sz w:val="26"/>
           <w:szCs w:val="26"/>
         </w:rPr>
-        <w:t xml:space="preserve">Amarillo luminoso – </w:t>
-      </w:r>
-      <w:r>
-        <w:rPr>
-          <w:rFonts w:ascii="Arial" w:hAnsi="Arial" w:cs="Arial"/>
-          <w:b/>
-          <w:bCs/>
-          <w:sz w:val="26"/>
-          <w:szCs w:val="26"/>
-        </w:rPr>
-        <w:t>alertas</w:t>
-      </w:r>
-      <w:r>
-        <w:rPr>
-          <w:rFonts w:ascii="Arial" w:hAnsi="Arial" w:cs="Arial"/>
-          <w:b/>
-          <w:bCs/>
-          <w:sz w:val="26"/>
-          <w:szCs w:val="26"/>
-        </w:rPr>
-        <w:t xml:space="preserve">: </w:t>
+        <w:t xml:space="preserve">Amarillo luminoso – alertas: </w:t>
       </w:r>
       <w:r>
         <w:rPr>
@@ -1799,15 +1675,7 @@
           <w:sz w:val="26"/>
           <w:szCs w:val="26"/>
         </w:rPr>
-        <w:t>#</w:t>
-      </w:r>
-      <w:r>
-        <w:rPr>
-          <w:rFonts w:ascii="Arial" w:hAnsi="Arial" w:cs="Arial"/>
-          <w:sz w:val="26"/>
-          <w:szCs w:val="26"/>
-        </w:rPr>
-        <w:t>A29B9D</w:t>
+        <w:t>#A29B9D</w:t>
       </w:r>
     </w:p>
     <w:p>
@@ -2501,60 +2369,1147 @@
     </w:p>
     <w:p>
       <w:pPr>
-        <w:pStyle w:val="Prrafodelista"/>
-        <w:ind w:left="1789"/>
-        <w:jc w:val="both"/>
-        <w:rPr>
-          <w:rFonts w:ascii="Arial" w:hAnsi="Arial" w:cs="Arial"/>
-          <w:b/>
-          <w:bCs/>
-          <w:sz w:val="26"/>
-          <w:szCs w:val="26"/>
-        </w:rPr>
-      </w:pPr>
+        <w:jc w:val="both"/>
+        <w:rPr>
+          <w:rFonts w:ascii="Arial" w:hAnsi="Arial" w:cs="Arial"/>
+          <w:b/>
+          <w:bCs/>
+          <w:sz w:val="26"/>
+          <w:szCs w:val="26"/>
+        </w:rPr>
+      </w:pPr>
+    </w:p>
+    <w:p>
+      <w:pPr>
+        <w:pStyle w:val="Prrafodelista"/>
+        <w:numPr>
+          <w:ilvl w:val="0"/>
+          <w:numId w:val="3"/>
+        </w:numPr>
+        <w:jc w:val="both"/>
+        <w:rPr>
+          <w:rFonts w:ascii="Arial" w:hAnsi="Arial" w:cs="Arial"/>
+          <w:b/>
+          <w:bCs/>
+          <w:sz w:val="26"/>
+          <w:szCs w:val="26"/>
+        </w:rPr>
+      </w:pPr>
+      <w:r>
+        <w:rPr>
+          <w:rFonts w:ascii="Arial" w:hAnsi="Arial" w:cs="Arial"/>
+          <w:b/>
+          <w:bCs/>
+          <w:sz w:val="26"/>
+          <w:szCs w:val="26"/>
+        </w:rPr>
+        <w:t xml:space="preserve">¿Cómo son los clientes? </w:t>
+      </w:r>
+      <w:r>
+        <w:rPr>
+          <w:rFonts w:ascii="Arial" w:hAnsi="Arial" w:cs="Arial"/>
+          <w:sz w:val="26"/>
+          <w:szCs w:val="26"/>
+        </w:rPr>
+        <w:t xml:space="preserve">Para responder esta pregunta hay 2 perspectivas diferentes, pero un mismo resultado. Y es que, desde la perspectiva de papelería Matrix a los demás, esos ‘demás’ ya son personas de 30 años o más (No todos) pero si una gran parte, lo cual hace que la interfaz y GUI para ellos deba ser bastante intuitiva y bastante simple. </w:t>
+      </w:r>
+    </w:p>
+    <w:p>
+      <w:pPr>
+        <w:ind w:left="1069"/>
+        <w:jc w:val="both"/>
+        <w:rPr>
+          <w:rFonts w:ascii="Arial" w:hAnsi="Arial" w:cs="Arial"/>
+          <w:sz w:val="26"/>
+          <w:szCs w:val="26"/>
+        </w:rPr>
+      </w:pPr>
+      <w:r>
+        <w:rPr>
+          <w:rFonts w:ascii="Arial" w:hAnsi="Arial" w:cs="Arial"/>
+          <w:sz w:val="26"/>
+          <w:szCs w:val="26"/>
+        </w:rPr>
+        <w:t>De la misma forma de este proyecto a papelería Matrix, la dueña del negocio es una mujer que la tecnología puede arroparla en parte, y, por ende, debe ser intuitivo.</w:t>
+      </w:r>
+    </w:p>
+    <w:p>
+      <w:pPr>
+        <w:ind w:left="1069"/>
+        <w:jc w:val="both"/>
+        <w:rPr>
+          <w:rFonts w:ascii="Arial" w:hAnsi="Arial" w:cs="Arial"/>
+          <w:sz w:val="26"/>
+          <w:szCs w:val="26"/>
+        </w:rPr>
+      </w:pPr>
+      <w:r>
+        <w:rPr>
+          <w:rFonts w:ascii="Arial" w:hAnsi="Arial" w:cs="Arial"/>
+          <w:b/>
+          <w:bCs/>
+          <w:sz w:val="26"/>
+          <w:szCs w:val="26"/>
+        </w:rPr>
+        <w:t xml:space="preserve">| En conclusión: </w:t>
+      </w:r>
+      <w:r>
+        <w:rPr>
+          <w:rFonts w:ascii="Arial" w:hAnsi="Arial" w:cs="Arial"/>
+          <w:sz w:val="26"/>
+          <w:szCs w:val="26"/>
+        </w:rPr>
+        <w:t>esta web debe ser bastante funcional con funciones complejas, pero debe ser fácil y muy detallada.</w:t>
+      </w:r>
+    </w:p>
+    <w:p>
+      <w:pPr>
+        <w:pStyle w:val="Prrafodelista"/>
+        <w:numPr>
+          <w:ilvl w:val="0"/>
+          <w:numId w:val="3"/>
+        </w:numPr>
+        <w:jc w:val="both"/>
+        <w:rPr>
+          <w:rFonts w:ascii="Arial" w:hAnsi="Arial" w:cs="Arial"/>
+          <w:b/>
+          <w:bCs/>
+          <w:sz w:val="26"/>
+          <w:szCs w:val="26"/>
+        </w:rPr>
+      </w:pPr>
+      <w:r>
+        <w:rPr>
+          <w:rFonts w:ascii="Arial" w:hAnsi="Arial" w:cs="Arial"/>
+          <w:b/>
+          <w:bCs/>
+          <w:sz w:val="26"/>
+          <w:szCs w:val="26"/>
+        </w:rPr>
+        <w:t>¿Qué problemas tiene hoy?</w:t>
+      </w:r>
+    </w:p>
+    <w:p>
+      <w:pPr>
+        <w:pStyle w:val="Prrafodelista"/>
+        <w:ind w:left="1069"/>
+        <w:jc w:val="both"/>
+        <w:rPr>
+          <w:rFonts w:ascii="Arial" w:hAnsi="Arial" w:cs="Arial"/>
+          <w:sz w:val="26"/>
+          <w:szCs w:val="26"/>
+        </w:rPr>
+      </w:pPr>
+      <w:r>
+        <w:rPr>
+          <w:rFonts w:ascii="Arial" w:hAnsi="Arial" w:cs="Arial"/>
+          <w:sz w:val="26"/>
+          <w:szCs w:val="26"/>
+        </w:rPr>
+        <w:t>Teniendo en cuenta que mi mamá no quiere involucrar chats, ni pagos, ni administración de dinero. El problema estaría centrado en:</w:t>
+      </w:r>
+    </w:p>
+    <w:p>
+      <w:pPr>
+        <w:pStyle w:val="Prrafodelista"/>
+        <w:numPr>
+          <w:ilvl w:val="0"/>
+          <w:numId w:val="10"/>
+        </w:numPr>
+        <w:jc w:val="both"/>
+        <w:rPr>
+          <w:rFonts w:ascii="Arial" w:hAnsi="Arial" w:cs="Arial"/>
+          <w:sz w:val="26"/>
+          <w:szCs w:val="26"/>
+        </w:rPr>
+      </w:pPr>
+      <w:r>
+        <w:rPr>
+          <w:rFonts w:ascii="Arial" w:hAnsi="Arial" w:cs="Arial"/>
+          <w:sz w:val="26"/>
+          <w:szCs w:val="26"/>
+        </w:rPr>
+        <w:t>Falta de inventario para la papelería, y de organización de datos, historiales.</w:t>
+      </w:r>
+    </w:p>
+    <w:p>
+      <w:pPr>
+        <w:pStyle w:val="Prrafodelista"/>
+        <w:numPr>
+          <w:ilvl w:val="0"/>
+          <w:numId w:val="10"/>
+        </w:numPr>
+        <w:jc w:val="both"/>
+        <w:rPr>
+          <w:rFonts w:ascii="Arial" w:hAnsi="Arial" w:cs="Arial"/>
+          <w:sz w:val="26"/>
+          <w:szCs w:val="26"/>
+        </w:rPr>
+      </w:pPr>
+      <w:r>
+        <w:rPr>
+          <w:rFonts w:ascii="Arial" w:hAnsi="Arial" w:cs="Arial"/>
+          <w:sz w:val="26"/>
+          <w:szCs w:val="26"/>
+        </w:rPr>
+        <w:t>Falta de registro de ventas de papelería, descuadres, etc.</w:t>
+      </w:r>
+    </w:p>
+    <w:p>
+      <w:pPr>
+        <w:pStyle w:val="Prrafodelista"/>
+        <w:numPr>
+          <w:ilvl w:val="0"/>
+          <w:numId w:val="10"/>
+        </w:numPr>
+        <w:jc w:val="both"/>
+        <w:rPr>
+          <w:rFonts w:ascii="Arial" w:hAnsi="Arial" w:cs="Arial"/>
+          <w:sz w:val="26"/>
+          <w:szCs w:val="26"/>
+        </w:rPr>
+      </w:pPr>
+      <w:r>
+        <w:rPr>
+          <w:rFonts w:ascii="Arial" w:hAnsi="Arial" w:cs="Arial"/>
+          <w:sz w:val="26"/>
+          <w:szCs w:val="26"/>
+        </w:rPr>
+        <w:t>Descuadres de dinero porque no se sabe cuánto imprimió en un día, cuantas copias sacó. (Historial de servicios)</w:t>
+      </w:r>
+    </w:p>
+    <w:p>
+      <w:pPr>
+        <w:pStyle w:val="Prrafodelista"/>
+        <w:numPr>
+          <w:ilvl w:val="0"/>
+          <w:numId w:val="10"/>
+        </w:numPr>
+        <w:jc w:val="both"/>
+        <w:rPr>
+          <w:rFonts w:ascii="Arial" w:hAnsi="Arial" w:cs="Arial"/>
+          <w:sz w:val="26"/>
+          <w:szCs w:val="26"/>
+        </w:rPr>
+      </w:pPr>
+      <w:r>
+        <w:rPr>
+          <w:rFonts w:ascii="Arial" w:hAnsi="Arial" w:cs="Arial"/>
+          <w:sz w:val="26"/>
+          <w:szCs w:val="26"/>
+        </w:rPr>
+        <w:t>Falta de centralización de información para los clientes.</w:t>
+      </w:r>
+    </w:p>
+    <w:p>
+      <w:pPr>
+        <w:pStyle w:val="Prrafodelista"/>
+        <w:numPr>
+          <w:ilvl w:val="0"/>
+          <w:numId w:val="10"/>
+        </w:numPr>
+        <w:jc w:val="both"/>
+        <w:rPr>
+          <w:rFonts w:ascii="Arial" w:hAnsi="Arial" w:cs="Arial"/>
+          <w:sz w:val="26"/>
+          <w:szCs w:val="26"/>
+        </w:rPr>
+      </w:pPr>
+      <w:r>
+        <w:rPr>
+          <w:rFonts w:ascii="Arial" w:hAnsi="Arial" w:cs="Arial"/>
+          <w:sz w:val="26"/>
+          <w:szCs w:val="26"/>
+        </w:rPr>
+        <w:t>Poca gestión a nivel general.</w:t>
+      </w:r>
+    </w:p>
+    <w:p>
+      <w:pPr>
+        <w:pStyle w:val="Prrafodelista"/>
+        <w:ind w:left="1920"/>
+        <w:jc w:val="both"/>
+        <w:rPr>
+          <w:rFonts w:ascii="Arial" w:hAnsi="Arial" w:cs="Arial"/>
+          <w:sz w:val="26"/>
+          <w:szCs w:val="26"/>
+        </w:rPr>
+      </w:pPr>
+    </w:p>
+    <w:p>
+      <w:pPr>
+        <w:pStyle w:val="Prrafodelista"/>
+        <w:numPr>
+          <w:ilvl w:val="0"/>
+          <w:numId w:val="3"/>
+        </w:numPr>
+        <w:jc w:val="both"/>
+        <w:rPr>
+          <w:rFonts w:ascii="Arial" w:hAnsi="Arial" w:cs="Arial"/>
+          <w:b/>
+          <w:bCs/>
+          <w:sz w:val="26"/>
+          <w:szCs w:val="26"/>
+        </w:rPr>
+      </w:pPr>
+      <w:r>
+        <w:rPr>
+          <w:rFonts w:ascii="Arial" w:hAnsi="Arial" w:cs="Arial"/>
+          <w:b/>
+          <w:bCs/>
+          <w:sz w:val="26"/>
+          <w:szCs w:val="26"/>
+        </w:rPr>
+        <w:t>¿Qué quiere que haga el programa?</w:t>
+      </w:r>
+      <w:r>
+        <w:rPr>
+          <w:rFonts w:ascii="Arial" w:hAnsi="Arial" w:cs="Arial"/>
+          <w:b/>
+          <w:bCs/>
+          <w:sz w:val="26"/>
+          <w:szCs w:val="26"/>
+        </w:rPr>
+        <w:t xml:space="preserve"> </w:t>
+      </w:r>
+      <w:r>
+        <w:rPr>
+          <w:rFonts w:ascii="Arial" w:hAnsi="Arial" w:cs="Arial"/>
+          <w:sz w:val="26"/>
+          <w:szCs w:val="26"/>
+        </w:rPr>
+        <w:t xml:space="preserve">El cliente (Papelería Matrix) desea que sus clientes puedan ver información sobre el negocio: horarios, actualizaciones, noticias, precios, requisitos para servicios. También la papelería con sus detalles. Además, como administradora quiere poder manejar gestión de su papelería, ver reportes (quizás generarlos), anexar fotos de su alianza con </w:t>
+      </w:r>
+      <w:proofErr w:type="spellStart"/>
+      <w:r>
+        <w:rPr>
+          <w:rFonts w:ascii="Arial" w:hAnsi="Arial" w:cs="Arial"/>
+          <w:sz w:val="26"/>
+          <w:szCs w:val="26"/>
+        </w:rPr>
+        <w:t>pulgero</w:t>
+      </w:r>
+      <w:proofErr w:type="spellEnd"/>
+      <w:r>
+        <w:rPr>
+          <w:rFonts w:ascii="Arial" w:hAnsi="Arial" w:cs="Arial"/>
+          <w:sz w:val="26"/>
+          <w:szCs w:val="26"/>
+        </w:rPr>
+        <w:t xml:space="preserve"> </w:t>
+      </w:r>
+      <w:proofErr w:type="spellStart"/>
+      <w:r>
+        <w:rPr>
+          <w:rFonts w:ascii="Arial" w:hAnsi="Arial" w:cs="Arial"/>
+          <w:sz w:val="26"/>
+          <w:szCs w:val="26"/>
+        </w:rPr>
+        <w:t>glam</w:t>
+      </w:r>
+      <w:proofErr w:type="spellEnd"/>
+      <w:r>
+        <w:rPr>
+          <w:rFonts w:ascii="Arial" w:hAnsi="Arial" w:cs="Arial"/>
+          <w:sz w:val="26"/>
+          <w:szCs w:val="26"/>
+        </w:rPr>
+        <w:t>, ver las estadísticas de servicios ofrecidos en el día y más que todo eso, manejar un historial. Ofreciendo otro usuario para aquellos que atienden el internet y vaya registrando cada entrada de servicio.</w:t>
+      </w:r>
+    </w:p>
+    <w:p>
+      <w:pPr>
+        <w:jc w:val="both"/>
+        <w:rPr>
+          <w:rFonts w:ascii="Arial" w:hAnsi="Arial" w:cs="Arial"/>
+          <w:b/>
+          <w:bCs/>
+          <w:sz w:val="26"/>
+          <w:szCs w:val="26"/>
+        </w:rPr>
+      </w:pPr>
+    </w:p>
+    <w:p>
+      <w:pPr>
+        <w:pStyle w:val="Prrafodelista"/>
+        <w:numPr>
+          <w:ilvl w:val="0"/>
+          <w:numId w:val="3"/>
+        </w:numPr>
+        <w:jc w:val="both"/>
+        <w:rPr>
+          <w:rFonts w:ascii="Arial" w:hAnsi="Arial" w:cs="Arial"/>
+          <w:b/>
+          <w:bCs/>
+          <w:sz w:val="26"/>
+          <w:szCs w:val="26"/>
+        </w:rPr>
+      </w:pPr>
+      <w:r>
+        <w:rPr>
+          <w:rFonts w:ascii="Arial" w:hAnsi="Arial" w:cs="Arial"/>
+          <w:b/>
+          <w:bCs/>
+          <w:sz w:val="26"/>
+          <w:szCs w:val="26"/>
+        </w:rPr>
+        <w:lastRenderedPageBreak/>
+        <w:t xml:space="preserve">¿Qué tarea desea automatizar? </w:t>
+      </w:r>
+      <w:r>
+        <w:rPr>
+          <w:rFonts w:ascii="Arial" w:hAnsi="Arial" w:cs="Arial"/>
+          <w:sz w:val="26"/>
+          <w:szCs w:val="26"/>
+        </w:rPr>
+        <w:t>Gestión de inventario, actualización de precios del internet, y generar estadísticas con hacer clic en un botón (Sea de papelería, servicios, reportes o rendimiento de operadores de cibercafé).</w:t>
+      </w:r>
+    </w:p>
+    <w:p>
+      <w:pPr>
+        <w:pStyle w:val="Prrafodelista"/>
+        <w:rPr>
+          <w:rFonts w:ascii="Arial" w:hAnsi="Arial" w:cs="Arial"/>
+          <w:b/>
+          <w:bCs/>
+          <w:sz w:val="26"/>
+          <w:szCs w:val="26"/>
+        </w:rPr>
+      </w:pPr>
+    </w:p>
+    <w:p>
+      <w:pPr>
+        <w:pStyle w:val="Prrafodelista"/>
+        <w:numPr>
+          <w:ilvl w:val="0"/>
+          <w:numId w:val="3"/>
+        </w:numPr>
+        <w:jc w:val="both"/>
+        <w:rPr>
+          <w:rFonts w:ascii="Arial" w:hAnsi="Arial" w:cs="Arial"/>
+          <w:b/>
+          <w:bCs/>
+          <w:sz w:val="26"/>
+          <w:szCs w:val="26"/>
+        </w:rPr>
+      </w:pPr>
+      <w:r>
+        <w:rPr>
+          <w:rFonts w:ascii="Arial" w:hAnsi="Arial" w:cs="Arial"/>
+          <w:b/>
+          <w:bCs/>
+          <w:sz w:val="26"/>
+          <w:szCs w:val="26"/>
+        </w:rPr>
+        <w:t xml:space="preserve">Información que desea guardar: </w:t>
+      </w:r>
+      <w:r>
+        <w:rPr>
+          <w:rFonts w:ascii="Arial" w:hAnsi="Arial" w:cs="Arial"/>
+          <w:sz w:val="26"/>
+          <w:szCs w:val="26"/>
+        </w:rPr>
+        <w:t xml:space="preserve">información sobre papelería, detalles del internet, datos sobre servicios y pulguero. </w:t>
+      </w:r>
+    </w:p>
+    <w:p>
+      <w:pPr>
+        <w:pStyle w:val="Prrafodelista"/>
+        <w:rPr>
+          <w:rFonts w:ascii="Arial" w:hAnsi="Arial" w:cs="Arial"/>
+          <w:b/>
+          <w:bCs/>
+          <w:sz w:val="26"/>
+          <w:szCs w:val="26"/>
+        </w:rPr>
+      </w:pPr>
+    </w:p>
+    <w:p>
+      <w:pPr>
+        <w:pStyle w:val="Prrafodelista"/>
+        <w:numPr>
+          <w:ilvl w:val="0"/>
+          <w:numId w:val="3"/>
+        </w:numPr>
+        <w:jc w:val="both"/>
+        <w:rPr>
+          <w:rFonts w:ascii="Arial" w:hAnsi="Arial" w:cs="Arial"/>
+          <w:b/>
+          <w:bCs/>
+          <w:sz w:val="26"/>
+          <w:szCs w:val="26"/>
+        </w:rPr>
+      </w:pPr>
+      <w:r>
+        <w:rPr>
+          <w:rFonts w:ascii="Arial" w:hAnsi="Arial" w:cs="Arial"/>
+          <w:b/>
+          <w:bCs/>
+          <w:sz w:val="26"/>
+          <w:szCs w:val="26"/>
+        </w:rPr>
+        <w:t xml:space="preserve">¿Quiénes usarán el sistema? </w:t>
+      </w:r>
+      <w:r>
+        <w:rPr>
+          <w:rFonts w:ascii="Arial" w:hAnsi="Arial" w:cs="Arial"/>
+          <w:sz w:val="26"/>
+          <w:szCs w:val="26"/>
+        </w:rPr>
+        <w:t>Administrador y operador de cibercafé.</w:t>
+      </w:r>
+    </w:p>
+    <w:p>
+      <w:pPr>
+        <w:pStyle w:val="Prrafodelista"/>
+        <w:rPr>
+          <w:rFonts w:ascii="Arial" w:hAnsi="Arial" w:cs="Arial"/>
+          <w:b/>
+          <w:bCs/>
+          <w:sz w:val="26"/>
+          <w:szCs w:val="26"/>
+        </w:rPr>
+      </w:pPr>
+    </w:p>
+    <w:p>
+      <w:pPr>
+        <w:pStyle w:val="Prrafodelista"/>
+        <w:numPr>
+          <w:ilvl w:val="0"/>
+          <w:numId w:val="3"/>
+        </w:numPr>
+        <w:jc w:val="both"/>
+        <w:rPr>
+          <w:rFonts w:ascii="Arial" w:hAnsi="Arial" w:cs="Arial"/>
+          <w:b/>
+          <w:bCs/>
+          <w:sz w:val="26"/>
+          <w:szCs w:val="26"/>
+        </w:rPr>
+      </w:pPr>
+      <w:r>
+        <w:rPr>
+          <w:rFonts w:ascii="Arial" w:hAnsi="Arial" w:cs="Arial"/>
+          <w:b/>
+          <w:bCs/>
+          <w:sz w:val="26"/>
+          <w:szCs w:val="26"/>
+        </w:rPr>
+        <w:t xml:space="preserve">Propósito principal del programa: </w:t>
+      </w:r>
+      <w:r>
+        <w:rPr>
+          <w:rFonts w:ascii="Arial" w:hAnsi="Arial" w:cs="Arial"/>
+          <w:sz w:val="26"/>
+          <w:szCs w:val="26"/>
+        </w:rPr>
+        <w:t>facilitar gestión de inventario, servicios, información y reportes automáticos.</w:t>
+      </w:r>
+    </w:p>
+    <w:p>
+      <w:pPr>
+        <w:pStyle w:val="Prrafodelista"/>
+        <w:rPr>
+          <w:rFonts w:ascii="Arial" w:hAnsi="Arial" w:cs="Arial"/>
+          <w:b/>
+          <w:bCs/>
+          <w:sz w:val="26"/>
+          <w:szCs w:val="26"/>
+        </w:rPr>
+      </w:pPr>
+    </w:p>
+    <w:p>
+      <w:pPr>
+        <w:pStyle w:val="Prrafodelista"/>
+        <w:numPr>
+          <w:ilvl w:val="0"/>
+          <w:numId w:val="3"/>
+        </w:numPr>
+        <w:jc w:val="both"/>
+        <w:rPr>
+          <w:rFonts w:ascii="Arial" w:hAnsi="Arial" w:cs="Arial"/>
+          <w:b/>
+          <w:bCs/>
+          <w:sz w:val="26"/>
+          <w:szCs w:val="26"/>
+        </w:rPr>
+      </w:pPr>
+      <w:r>
+        <w:rPr>
+          <w:rFonts w:ascii="Arial" w:hAnsi="Arial" w:cs="Arial"/>
+          <w:b/>
+          <w:bCs/>
+          <w:sz w:val="26"/>
+          <w:szCs w:val="26"/>
+        </w:rPr>
+        <w:t xml:space="preserve">Beneficio esperado: </w:t>
+      </w:r>
+      <w:r>
+        <w:rPr>
+          <w:rFonts w:ascii="Arial" w:hAnsi="Arial" w:cs="Arial"/>
+          <w:sz w:val="26"/>
+          <w:szCs w:val="26"/>
+        </w:rPr>
+        <w:t>facilidad, comodidad y reportes.</w:t>
+      </w:r>
+    </w:p>
+    <w:p>
+      <w:pPr>
+        <w:pStyle w:val="Prrafodelista"/>
+        <w:rPr>
+          <w:rFonts w:ascii="Arial" w:hAnsi="Arial" w:cs="Arial"/>
+          <w:b/>
+          <w:bCs/>
+          <w:sz w:val="26"/>
+          <w:szCs w:val="26"/>
+        </w:rPr>
+      </w:pPr>
+    </w:p>
+    <w:p>
+      <w:pPr>
+        <w:pStyle w:val="Prrafodelista"/>
+        <w:numPr>
+          <w:ilvl w:val="0"/>
+          <w:numId w:val="3"/>
+        </w:numPr>
+        <w:jc w:val="both"/>
+        <w:rPr>
+          <w:rFonts w:ascii="Arial" w:hAnsi="Arial" w:cs="Arial"/>
+          <w:b/>
+          <w:bCs/>
+          <w:sz w:val="26"/>
+          <w:szCs w:val="26"/>
+        </w:rPr>
+      </w:pPr>
+      <w:r>
+        <w:rPr>
+          <w:rFonts w:ascii="Arial" w:hAnsi="Arial" w:cs="Arial"/>
+          <w:b/>
+          <w:bCs/>
+          <w:sz w:val="26"/>
+          <w:szCs w:val="26"/>
+        </w:rPr>
+        <w:t xml:space="preserve">Requisitos deseables: </w:t>
+      </w:r>
+      <w:r>
+        <w:rPr>
+          <w:rFonts w:ascii="Arial" w:hAnsi="Arial" w:cs="Arial"/>
+          <w:sz w:val="26"/>
+          <w:szCs w:val="26"/>
+        </w:rPr>
+        <w:t>utilizar inteligencia artificial. (Para consejos recomendaciones)</w:t>
+      </w:r>
+    </w:p>
+    <w:p>
+      <w:pPr>
+        <w:pStyle w:val="Prrafodelista"/>
+        <w:rPr>
+          <w:rFonts w:ascii="Arial" w:hAnsi="Arial" w:cs="Arial"/>
+          <w:b/>
+          <w:bCs/>
+          <w:sz w:val="26"/>
+          <w:szCs w:val="26"/>
+        </w:rPr>
+      </w:pPr>
+    </w:p>
+    <w:p>
+      <w:pPr>
+        <w:pStyle w:val="Prrafodelista"/>
+        <w:numPr>
+          <w:ilvl w:val="0"/>
+          <w:numId w:val="3"/>
+        </w:numPr>
+        <w:jc w:val="both"/>
+        <w:rPr>
+          <w:rFonts w:ascii="Arial" w:hAnsi="Arial" w:cs="Arial"/>
+          <w:b/>
+          <w:bCs/>
+          <w:sz w:val="26"/>
+          <w:szCs w:val="26"/>
+        </w:rPr>
+      </w:pPr>
+      <w:r>
+        <w:rPr>
+          <w:rFonts w:ascii="Arial" w:hAnsi="Arial" w:cs="Arial"/>
+          <w:b/>
+          <w:bCs/>
+          <w:sz w:val="26"/>
+          <w:szCs w:val="26"/>
+        </w:rPr>
+        <w:t xml:space="preserve">Requisito crítico: </w:t>
+      </w:r>
+      <w:r>
+        <w:rPr>
+          <w:rFonts w:ascii="Arial" w:hAnsi="Arial" w:cs="Arial"/>
+          <w:sz w:val="26"/>
+          <w:szCs w:val="26"/>
+        </w:rPr>
+        <w:t>saber detalles de cada operación.</w:t>
+      </w:r>
+    </w:p>
+    <w:p>
+      <w:pPr>
+        <w:pStyle w:val="Prrafodelista"/>
+        <w:rPr>
+          <w:rFonts w:ascii="Arial" w:hAnsi="Arial" w:cs="Arial"/>
+          <w:b/>
+          <w:bCs/>
+          <w:sz w:val="26"/>
+          <w:szCs w:val="26"/>
+        </w:rPr>
+      </w:pPr>
+    </w:p>
+    <w:p>
+      <w:pPr>
+        <w:pStyle w:val="Prrafodelista"/>
+        <w:numPr>
+          <w:ilvl w:val="0"/>
+          <w:numId w:val="3"/>
+        </w:numPr>
+        <w:jc w:val="both"/>
+        <w:rPr>
+          <w:rFonts w:ascii="Arial" w:hAnsi="Arial" w:cs="Arial"/>
+          <w:b/>
+          <w:bCs/>
+          <w:sz w:val="26"/>
+          <w:szCs w:val="26"/>
+        </w:rPr>
+      </w:pPr>
+      <w:r>
+        <w:rPr>
+          <w:rFonts w:ascii="Arial" w:hAnsi="Arial" w:cs="Arial"/>
+          <w:b/>
+          <w:bCs/>
+          <w:sz w:val="26"/>
+          <w:szCs w:val="26"/>
+        </w:rPr>
+        <w:t xml:space="preserve">¿Lo usará desde computadora o teléfono? </w:t>
+      </w:r>
+      <w:r>
+        <w:rPr>
+          <w:rFonts w:ascii="Arial" w:hAnsi="Arial" w:cs="Arial"/>
+          <w:sz w:val="26"/>
+          <w:szCs w:val="26"/>
+        </w:rPr>
+        <w:t>Desde computadora.</w:t>
+      </w:r>
+    </w:p>
+    <w:p>
+      <w:pPr>
+        <w:pStyle w:val="Prrafodelista"/>
+        <w:rPr>
+          <w:rFonts w:ascii="Arial" w:hAnsi="Arial" w:cs="Arial"/>
+          <w:b/>
+          <w:bCs/>
+          <w:sz w:val="26"/>
+          <w:szCs w:val="26"/>
+        </w:rPr>
+      </w:pPr>
+    </w:p>
+    <w:p>
+      <w:pPr>
+        <w:pStyle w:val="Prrafodelista"/>
+        <w:numPr>
+          <w:ilvl w:val="0"/>
+          <w:numId w:val="3"/>
+        </w:numPr>
+        <w:jc w:val="both"/>
+        <w:rPr>
+          <w:rFonts w:ascii="Arial" w:hAnsi="Arial" w:cs="Arial"/>
+          <w:b/>
+          <w:bCs/>
+          <w:sz w:val="26"/>
+          <w:szCs w:val="26"/>
+        </w:rPr>
+      </w:pPr>
+      <w:r>
+        <w:rPr>
+          <w:rFonts w:ascii="Arial" w:hAnsi="Arial" w:cs="Arial"/>
+          <w:b/>
+          <w:bCs/>
+          <w:sz w:val="26"/>
+          <w:szCs w:val="26"/>
+        </w:rPr>
+        <w:t xml:space="preserve">¿Necesita internet? </w:t>
+      </w:r>
+      <w:r>
+        <w:rPr>
+          <w:rFonts w:ascii="Arial" w:hAnsi="Arial" w:cs="Arial"/>
+          <w:sz w:val="26"/>
+          <w:szCs w:val="26"/>
+        </w:rPr>
+        <w:t>Sí.</w:t>
+      </w:r>
+    </w:p>
+    <w:p>
+      <w:pPr>
+        <w:pStyle w:val="Prrafodelista"/>
+        <w:rPr>
+          <w:rFonts w:ascii="Arial" w:hAnsi="Arial" w:cs="Arial"/>
+          <w:b/>
+          <w:bCs/>
+          <w:sz w:val="26"/>
+          <w:szCs w:val="26"/>
+        </w:rPr>
+      </w:pPr>
+    </w:p>
+    <w:p>
+      <w:pPr>
+        <w:pStyle w:val="Prrafodelista"/>
+        <w:numPr>
+          <w:ilvl w:val="0"/>
+          <w:numId w:val="3"/>
+        </w:numPr>
+        <w:jc w:val="both"/>
+        <w:rPr>
+          <w:rFonts w:ascii="Arial" w:hAnsi="Arial" w:cs="Arial"/>
+          <w:b/>
+          <w:bCs/>
+          <w:sz w:val="26"/>
+          <w:szCs w:val="26"/>
+        </w:rPr>
+      </w:pPr>
+      <w:r>
+        <w:rPr>
+          <w:rFonts w:ascii="Arial" w:hAnsi="Arial" w:cs="Arial"/>
+          <w:b/>
+          <w:bCs/>
+          <w:sz w:val="26"/>
+          <w:szCs w:val="26"/>
+        </w:rPr>
+        <w:t xml:space="preserve">¿Permisos de acceso? </w:t>
+      </w:r>
+      <w:r>
+        <w:rPr>
+          <w:rFonts w:ascii="Arial" w:hAnsi="Arial" w:cs="Arial"/>
+          <w:sz w:val="26"/>
+          <w:szCs w:val="26"/>
+        </w:rPr>
+        <w:t>Sí.</w:t>
+      </w:r>
+    </w:p>
+    <w:p>
+      <w:pPr>
+        <w:pStyle w:val="Prrafodelista"/>
+        <w:rPr>
+          <w:rFonts w:ascii="Arial" w:hAnsi="Arial" w:cs="Arial"/>
+          <w:b/>
+          <w:bCs/>
+          <w:sz w:val="26"/>
+          <w:szCs w:val="26"/>
+        </w:rPr>
+      </w:pPr>
+    </w:p>
+    <w:p>
+      <w:pPr>
+        <w:jc w:val="both"/>
+        <w:rPr>
+          <w:rFonts w:ascii="Arial" w:hAnsi="Arial" w:cs="Arial"/>
+          <w:b/>
+          <w:bCs/>
+          <w:sz w:val="26"/>
+          <w:szCs w:val="26"/>
+        </w:rPr>
+      </w:pPr>
+      <w:r>
+        <w:rPr>
+          <w:rFonts w:ascii="Arial" w:hAnsi="Arial" w:cs="Arial"/>
+          <w:b/>
+          <w:bCs/>
+          <w:sz w:val="26"/>
+          <w:szCs w:val="26"/>
+        </w:rPr>
+        <w:t>Fuentes de información:</w:t>
+      </w:r>
+    </w:p>
+    <w:p>
+      <w:pPr>
+        <w:pStyle w:val="Prrafodelista"/>
+        <w:numPr>
+          <w:ilvl w:val="0"/>
+          <w:numId w:val="13"/>
+        </w:numPr>
+        <w:jc w:val="both"/>
+        <w:rPr>
+          <w:rFonts w:ascii="Arial" w:hAnsi="Arial" w:cs="Arial"/>
+          <w:b/>
+          <w:bCs/>
+          <w:sz w:val="26"/>
+          <w:szCs w:val="26"/>
+        </w:rPr>
+      </w:pPr>
+      <w:r>
+        <w:rPr>
+          <w:rFonts w:ascii="Arial" w:hAnsi="Arial" w:cs="Arial"/>
+          <w:b/>
+          <w:bCs/>
+          <w:sz w:val="26"/>
+          <w:szCs w:val="26"/>
+        </w:rPr>
+        <w:t xml:space="preserve">Para extracción de colores: </w:t>
+      </w:r>
+      <w:r>
+        <w:rPr>
+          <w:rFonts w:ascii="Arial" w:hAnsi="Arial" w:cs="Arial"/>
+          <w:sz w:val="26"/>
+          <w:szCs w:val="26"/>
+        </w:rPr>
+        <w:t xml:space="preserve">uso de inteligencia artificial, </w:t>
+      </w:r>
+      <w:proofErr w:type="spellStart"/>
+      <w:r>
+        <w:rPr>
+          <w:rFonts w:ascii="Arial" w:hAnsi="Arial" w:cs="Arial"/>
+          <w:sz w:val="26"/>
+          <w:szCs w:val="26"/>
+        </w:rPr>
+        <w:t>chatGPT</w:t>
+      </w:r>
+      <w:proofErr w:type="spellEnd"/>
+      <w:r>
+        <w:rPr>
+          <w:rFonts w:ascii="Arial" w:hAnsi="Arial" w:cs="Arial"/>
+          <w:sz w:val="26"/>
+          <w:szCs w:val="26"/>
+        </w:rPr>
+        <w:t>.</w:t>
+      </w:r>
+    </w:p>
+    <w:p>
+      <w:pPr>
+        <w:pStyle w:val="Prrafodelista"/>
+        <w:numPr>
+          <w:ilvl w:val="0"/>
+          <w:numId w:val="13"/>
+        </w:numPr>
+        <w:jc w:val="both"/>
+        <w:rPr>
+          <w:rFonts w:ascii="Arial" w:hAnsi="Arial" w:cs="Arial"/>
+          <w:b/>
+          <w:bCs/>
+          <w:sz w:val="26"/>
+          <w:szCs w:val="26"/>
+        </w:rPr>
+      </w:pPr>
+      <w:r>
+        <w:rPr>
+          <w:rFonts w:ascii="Arial" w:hAnsi="Arial" w:cs="Arial"/>
+          <w:b/>
+          <w:bCs/>
+          <w:sz w:val="26"/>
+          <w:szCs w:val="26"/>
+        </w:rPr>
+        <w:t>Para todo el documento requerido (preguntas):</w:t>
+      </w:r>
+    </w:p>
+    <w:p>
+      <w:pPr>
+        <w:pStyle w:val="Prrafodelista"/>
+        <w:numPr>
+          <w:ilvl w:val="0"/>
+          <w:numId w:val="10"/>
+        </w:numPr>
+        <w:jc w:val="both"/>
+        <w:rPr>
+          <w:rFonts w:ascii="Arial" w:hAnsi="Arial" w:cs="Arial"/>
+          <w:b/>
+          <w:bCs/>
+          <w:sz w:val="26"/>
+          <w:szCs w:val="26"/>
+        </w:rPr>
+      </w:pPr>
+      <w:r>
+        <w:rPr>
+          <w:rFonts w:ascii="Arial" w:hAnsi="Arial" w:cs="Arial"/>
+          <w:sz w:val="26"/>
+          <w:szCs w:val="26"/>
+        </w:rPr>
+        <w:t>Entrevista con el cliente.</w:t>
+      </w:r>
+    </w:p>
+    <w:p>
+      <w:pPr>
+        <w:pStyle w:val="Prrafodelista"/>
+        <w:numPr>
+          <w:ilvl w:val="0"/>
+          <w:numId w:val="10"/>
+        </w:numPr>
+        <w:jc w:val="both"/>
+        <w:rPr>
+          <w:rFonts w:ascii="Arial" w:hAnsi="Arial" w:cs="Arial"/>
+          <w:b/>
+          <w:bCs/>
+          <w:sz w:val="26"/>
+          <w:szCs w:val="26"/>
+        </w:rPr>
+      </w:pPr>
+      <w:r>
+        <w:rPr>
+          <w:rFonts w:ascii="Arial" w:hAnsi="Arial" w:cs="Arial"/>
+          <w:sz w:val="26"/>
+          <w:szCs w:val="26"/>
+        </w:rPr>
+        <w:t>Formulario realizado.</w:t>
+      </w:r>
+    </w:p>
+    <w:p>
+      <w:pPr>
+        <w:pStyle w:val="Prrafodelista"/>
+        <w:numPr>
+          <w:ilvl w:val="0"/>
+          <w:numId w:val="10"/>
+        </w:numPr>
+        <w:jc w:val="both"/>
+        <w:rPr>
+          <w:rFonts w:ascii="Arial" w:hAnsi="Arial" w:cs="Arial"/>
+          <w:b/>
+          <w:bCs/>
+          <w:sz w:val="26"/>
+          <w:szCs w:val="26"/>
+        </w:rPr>
+      </w:pPr>
+      <w:r>
+        <w:rPr>
+          <w:rFonts w:ascii="Arial" w:hAnsi="Arial" w:cs="Arial"/>
+          <w:sz w:val="26"/>
+          <w:szCs w:val="26"/>
+        </w:rPr>
+        <w:t>Observación directa.</w:t>
+      </w:r>
+    </w:p>
+    <w:p>
+      <w:pPr>
+        <w:pStyle w:val="Prrafodelista"/>
+        <w:numPr>
+          <w:ilvl w:val="0"/>
+          <w:numId w:val="10"/>
+        </w:numPr>
+        <w:jc w:val="both"/>
+        <w:rPr>
+          <w:rFonts w:ascii="Arial" w:hAnsi="Arial" w:cs="Arial"/>
+          <w:b/>
+          <w:bCs/>
+          <w:sz w:val="26"/>
+          <w:szCs w:val="26"/>
+        </w:rPr>
+      </w:pPr>
+      <w:r>
+        <w:rPr>
+          <w:rFonts w:ascii="Arial" w:hAnsi="Arial" w:cs="Arial"/>
+          <w:sz w:val="26"/>
+          <w:szCs w:val="26"/>
+        </w:rPr>
+        <w:t>Análisis del negocio en cada situación presentada.</w:t>
+      </w:r>
+    </w:p>
+    <w:p>
+      <w:pPr>
+        <w:pStyle w:val="Prrafodelista"/>
+        <w:jc w:val="both"/>
+        <w:rPr>
+          <w:rFonts w:ascii="Arial" w:hAnsi="Arial" w:cs="Arial"/>
+          <w:b/>
+          <w:bCs/>
+          <w:sz w:val="20"/>
+          <w:szCs w:val="20"/>
+        </w:rPr>
+      </w:pPr>
+    </w:p>
+    <w:p>
+      <w:pPr>
+        <w:pStyle w:val="Prrafodelista"/>
+        <w:jc w:val="both"/>
+        <w:rPr>
+          <w:rFonts w:ascii="Arial" w:hAnsi="Arial" w:cs="Arial"/>
+          <w:b/>
+          <w:bCs/>
+          <w:sz w:val="20"/>
+          <w:szCs w:val="20"/>
+        </w:rPr>
+      </w:pPr>
+    </w:p>
+    <w:p>
+      <w:pPr>
+        <w:pStyle w:val="Prrafodelista"/>
+        <w:jc w:val="both"/>
+        <w:rPr>
+          <w:rFonts w:ascii="Arial" w:hAnsi="Arial" w:cs="Arial"/>
+          <w:b/>
+          <w:bCs/>
+          <w:sz w:val="20"/>
+          <w:szCs w:val="20"/>
+        </w:rPr>
+      </w:pPr>
+      <w:r>
+        <w:rPr>
+          <w:rFonts w:ascii="Arial" w:hAnsi="Arial" w:cs="Arial"/>
+          <w:b/>
+          <w:bCs/>
+          <w:sz w:val="20"/>
+          <w:szCs w:val="20"/>
+        </w:rPr>
+        <w:t>Hecho por Orozco Adrián.</w:t>
+      </w:r>
+    </w:p>
+    <w:p>
+      <w:pPr>
+        <w:pStyle w:val="Prrafodelista"/>
+        <w:jc w:val="both"/>
+        <w:rPr>
+          <w:rFonts w:ascii="Arial" w:hAnsi="Arial" w:cs="Arial"/>
+          <w:sz w:val="20"/>
+          <w:szCs w:val="20"/>
+        </w:rPr>
+      </w:pPr>
+      <w:r>
+        <w:rPr>
+          <w:rFonts w:ascii="Arial" w:hAnsi="Arial" w:cs="Arial"/>
+          <w:b/>
+          <w:bCs/>
+          <w:sz w:val="20"/>
+          <w:szCs w:val="20"/>
+        </w:rPr>
+        <w:t xml:space="preserve">email: </w:t>
+      </w:r>
+      <w:hyperlink r:id="rId9" w:history="1">
+        <w:r>
+          <w:rPr>
+            <w:rStyle w:val="Hipervnculo"/>
+            <w:rFonts w:ascii="Arial" w:hAnsi="Arial" w:cs="Arial"/>
+            <w:sz w:val="20"/>
+            <w:szCs w:val="20"/>
+          </w:rPr>
+          <w:t>adrianenriqueorozco@gmail.com</w:t>
+        </w:r>
+      </w:hyperlink>
+    </w:p>
+    <w:p>
+      <w:pPr>
+        <w:pStyle w:val="Prrafodelista"/>
+        <w:jc w:val="both"/>
+        <w:rPr>
+          <w:rFonts w:ascii="Arial" w:hAnsi="Arial" w:cs="Arial"/>
+          <w:b/>
+          <w:bCs/>
+          <w:sz w:val="20"/>
+          <w:szCs w:val="20"/>
+        </w:rPr>
+      </w:pPr>
+      <w:r>
+        <w:rPr>
+          <w:rFonts w:ascii="Arial" w:hAnsi="Arial" w:cs="Arial"/>
+          <w:b/>
+          <w:bCs/>
+          <w:sz w:val="20"/>
+          <w:szCs w:val="20"/>
+        </w:rPr>
+        <w:t xml:space="preserve"> </w:t>
+      </w:r>
       <w:bookmarkStart w:id="0" w:name="_GoBack"/>
       <w:bookmarkEnd w:id="0"/>
     </w:p>
-    <w:p>
-      <w:pPr>
-        <w:pStyle w:val="Prrafodelista"/>
-        <w:jc w:val="both"/>
-        <w:rPr>
-          <w:rFonts w:ascii="Arial" w:hAnsi="Arial" w:cs="Arial"/>
-          <w:sz w:val="26"/>
-          <w:szCs w:val="26"/>
-        </w:rPr>
-      </w:pPr>
-    </w:p>
-    <w:p>
-      <w:pPr>
-        <w:pStyle w:val="Prrafodelista"/>
-        <w:ind w:left="2124"/>
-        <w:jc w:val="both"/>
-        <w:rPr>
-          <w:rFonts w:ascii="Arial" w:hAnsi="Arial" w:cs="Arial"/>
-          <w:b/>
-          <w:bCs/>
-          <w:sz w:val="26"/>
-          <w:szCs w:val="26"/>
-        </w:rPr>
-      </w:pPr>
-    </w:p>
-    <w:p>
-      <w:pPr>
-        <w:pStyle w:val="Prrafodelista"/>
-        <w:jc w:val="both"/>
-        <w:rPr>
-          <w:rFonts w:ascii="Arial" w:hAnsi="Arial" w:cs="Arial"/>
-          <w:b/>
-          <w:bCs/>
-          <w:sz w:val="26"/>
-          <w:szCs w:val="26"/>
-        </w:rPr>
-      </w:pPr>
-    </w:p>
     <w:sectPr>
-      <w:headerReference w:type="default" r:id="rId9"/>
+      <w:headerReference w:type="default" r:id="rId10"/>
       <w:pgSz w:w="12240" w:h="15840"/>
       <w:pgMar w:top="1417" w:right="1701" w:bottom="1417" w:left="1701" w:header="708" w:footer="708" w:gutter="0"/>
       <w:pgBorders w:offsetFrom="page">
@@ -2630,6 +3585,7 @@
         <w:docPartUnique/>
       </w:docPartObj>
     </w:sdtPr>
+    <w:sdtEndPr/>
     <w:sdtContent>
       <w:p>
         <w:pPr>
@@ -2668,6 +3624,95 @@
 <file path=word/numbering.xml><?xml version="1.0" encoding="utf-8"?>
 <w:numbering xmlns:wpc="http://schemas.microsoft.com/office/word/2010/wordprocessingCanvas" xmlns:cx="http://schemas.microsoft.com/office/drawing/2014/chartex" xmlns:cx1="http://schemas.microsoft.com/office/drawing/2015/9/8/chartex" xmlns:cx2="http://schemas.microsoft.com/office/drawing/2015/10/21/chartex" xmlns:cx3="http://schemas.microsoft.com/office/drawing/2016/5/9/chartex" xmlns:cx4="http://schemas.microsoft.com/office/drawing/2016/5/10/chartex" xmlns:cx5="http://schemas.microsoft.com/office/drawing/2016/5/11/chartex" xmlns:cx6="http://schemas.microsoft.com/office/drawing/2016/5/12/chartex" xmlns:cx7="http://schemas.microsoft.com/office/drawing/2016/5/13/chartex" xmlns:cx8="http://schemas.microsoft.com/office/drawing/2016/5/14/chartex" xmlns:mc="http://schemas.openxmlformats.org/markup-compatibility/2006" xmlns:aink="http://schemas.microsoft.com/office/drawing/2016/ink" xmlns:am3d="http://schemas.microsoft.com/office/drawing/2017/model3d" xmlns:o="urn:schemas-microsoft-com:office:office" xmlns:r="http://schemas.openxmlformats.org/officeDocument/2006/relationships" xmlns:m="http://schemas.openxmlformats.org/officeDocument/2006/math" xmlns:v="urn:schemas-microsoft-com:vml" xmlns:wp14="http://schemas.microsoft.com/office/word/2010/wordprocessingDrawing" xmlns:wp="http://schemas.openxmlformats.org/drawingml/2006/wordprocessingDrawing" xmlns:w10="urn:schemas-microsoft-com:office:word" xmlns:w="http://schemas.openxmlformats.org/wordprocessingml/2006/main" xmlns:w14="http://schemas.microsoft.com/office/word/2010/wordml" xmlns:w15="http://schemas.microsoft.com/office/word/2012/wordml" xmlns:w16cid="http://schemas.microsoft.com/office/word/2016/wordml/cid" xmlns:w16se="http://schemas.microsoft.com/office/word/2015/wordml/symex" xmlns:wpg="http://schemas.microsoft.com/office/word/2010/wordprocessingGroup" xmlns:wpi="http://schemas.microsoft.com/office/word/2010/wordprocessingInk" xmlns:wne="http://schemas.microsoft.com/office/word/2006/wordml" xmlns:wps="http://schemas.microsoft.com/office/word/2010/wordprocessingShape" mc:Ignorable="w14 w15 w16se w16cid wp14">
   <w:abstractNum w:abstractNumId="0" w15:restartNumberingAfterBreak="0">
+    <w:nsid w:val="16876003"/>
+    <w:multiLevelType w:val="hybridMultilevel"/>
+    <w:tmpl w:val="162E63CC"/>
+    <w:lvl w:ilvl="0" w:tplc="240A000F">
+      <w:start w:val="1"/>
+      <w:numFmt w:val="decimal"/>
+      <w:lvlText w:val="%1."/>
+      <w:lvlJc w:val="left"/>
+      <w:pPr>
+        <w:ind w:left="720" w:hanging="360"/>
+      </w:pPr>
+      <w:rPr>
+        <w:rFonts w:hint="default"/>
+      </w:rPr>
+    </w:lvl>
+    <w:lvl w:ilvl="1" w:tplc="240A0019" w:tentative="1">
+      <w:start w:val="1"/>
+      <w:numFmt w:val="lowerLetter"/>
+      <w:lvlText w:val="%2."/>
+      <w:lvlJc w:val="left"/>
+      <w:pPr>
+        <w:ind w:left="1440" w:hanging="360"/>
+      </w:pPr>
+    </w:lvl>
+    <w:lvl w:ilvl="2" w:tplc="240A001B" w:tentative="1">
+      <w:start w:val="1"/>
+      <w:numFmt w:val="lowerRoman"/>
+      <w:lvlText w:val="%3."/>
+      <w:lvlJc w:val="right"/>
+      <w:pPr>
+        <w:ind w:left="2160" w:hanging="180"/>
+      </w:pPr>
+    </w:lvl>
+    <w:lvl w:ilvl="3" w:tplc="240A000F" w:tentative="1">
+      <w:start w:val="1"/>
+      <w:numFmt w:val="decimal"/>
+      <w:lvlText w:val="%4."/>
+      <w:lvlJc w:val="left"/>
+      <w:pPr>
+        <w:ind w:left="2880" w:hanging="360"/>
+      </w:pPr>
+    </w:lvl>
+    <w:lvl w:ilvl="4" w:tplc="240A0019" w:tentative="1">
+      <w:start w:val="1"/>
+      <w:numFmt w:val="lowerLetter"/>
+      <w:lvlText w:val="%5."/>
+      <w:lvlJc w:val="left"/>
+      <w:pPr>
+        <w:ind w:left="3600" w:hanging="360"/>
+      </w:pPr>
+    </w:lvl>
+    <w:lvl w:ilvl="5" w:tplc="240A001B" w:tentative="1">
+      <w:start w:val="1"/>
+      <w:numFmt w:val="lowerRoman"/>
+      <w:lvlText w:val="%6."/>
+      <w:lvlJc w:val="right"/>
+      <w:pPr>
+        <w:ind w:left="4320" w:hanging="180"/>
+      </w:pPr>
+    </w:lvl>
+    <w:lvl w:ilvl="6" w:tplc="240A000F" w:tentative="1">
+      <w:start w:val="1"/>
+      <w:numFmt w:val="decimal"/>
+      <w:lvlText w:val="%7."/>
+      <w:lvlJc w:val="left"/>
+      <w:pPr>
+        <w:ind w:left="5040" w:hanging="360"/>
+      </w:pPr>
+    </w:lvl>
+    <w:lvl w:ilvl="7" w:tplc="240A0019" w:tentative="1">
+      <w:start w:val="1"/>
+      <w:numFmt w:val="lowerLetter"/>
+      <w:lvlText w:val="%8."/>
+      <w:lvlJc w:val="left"/>
+      <w:pPr>
+        <w:ind w:left="5760" w:hanging="360"/>
+      </w:pPr>
+    </w:lvl>
+    <w:lvl w:ilvl="8" w:tplc="240A001B" w:tentative="1">
+      <w:start w:val="1"/>
+      <w:numFmt w:val="lowerRoman"/>
+      <w:lvlText w:val="%9."/>
+      <w:lvlJc w:val="right"/>
+      <w:pPr>
+        <w:ind w:left="6480" w:hanging="180"/>
+      </w:pPr>
+    </w:lvl>
+  </w:abstractNum>
+  <w:abstractNum w:abstractNumId="1" w15:restartNumberingAfterBreak="0">
     <w:nsid w:val="291F4C9A"/>
     <w:multiLevelType w:val="hybridMultilevel"/>
     <w:tmpl w:val="0E12497E"/>
@@ -2780,7 +3825,96 @@
       </w:rPr>
     </w:lvl>
   </w:abstractNum>
-  <w:abstractNum w:abstractNumId="1" w15:restartNumberingAfterBreak="0">
+  <w:abstractNum w:abstractNumId="2" w15:restartNumberingAfterBreak="0">
+    <w:nsid w:val="299A3254"/>
+    <w:multiLevelType w:val="hybridMultilevel"/>
+    <w:tmpl w:val="3B56B276"/>
+    <w:lvl w:ilvl="0" w:tplc="49C0AE04">
+      <w:start w:val="1"/>
+      <w:numFmt w:val="upperRoman"/>
+      <w:lvlText w:val="%1."/>
+      <w:lvlJc w:val="left"/>
+      <w:pPr>
+        <w:ind w:left="1080" w:hanging="720"/>
+      </w:pPr>
+      <w:rPr>
+        <w:rFonts w:hint="default"/>
+      </w:rPr>
+    </w:lvl>
+    <w:lvl w:ilvl="1" w:tplc="240A0019" w:tentative="1">
+      <w:start w:val="1"/>
+      <w:numFmt w:val="lowerLetter"/>
+      <w:lvlText w:val="%2."/>
+      <w:lvlJc w:val="left"/>
+      <w:pPr>
+        <w:ind w:left="1440" w:hanging="360"/>
+      </w:pPr>
+    </w:lvl>
+    <w:lvl w:ilvl="2" w:tplc="240A001B" w:tentative="1">
+      <w:start w:val="1"/>
+      <w:numFmt w:val="lowerRoman"/>
+      <w:lvlText w:val="%3."/>
+      <w:lvlJc w:val="right"/>
+      <w:pPr>
+        <w:ind w:left="2160" w:hanging="180"/>
+      </w:pPr>
+    </w:lvl>
+    <w:lvl w:ilvl="3" w:tplc="240A000F" w:tentative="1">
+      <w:start w:val="1"/>
+      <w:numFmt w:val="decimal"/>
+      <w:lvlText w:val="%4."/>
+      <w:lvlJc w:val="left"/>
+      <w:pPr>
+        <w:ind w:left="2880" w:hanging="360"/>
+      </w:pPr>
+    </w:lvl>
+    <w:lvl w:ilvl="4" w:tplc="240A0019" w:tentative="1">
+      <w:start w:val="1"/>
+      <w:numFmt w:val="lowerLetter"/>
+      <w:lvlText w:val="%5."/>
+      <w:lvlJc w:val="left"/>
+      <w:pPr>
+        <w:ind w:left="3600" w:hanging="360"/>
+      </w:pPr>
+    </w:lvl>
+    <w:lvl w:ilvl="5" w:tplc="240A001B" w:tentative="1">
+      <w:start w:val="1"/>
+      <w:numFmt w:val="lowerRoman"/>
+      <w:lvlText w:val="%6."/>
+      <w:lvlJc w:val="right"/>
+      <w:pPr>
+        <w:ind w:left="4320" w:hanging="180"/>
+      </w:pPr>
+    </w:lvl>
+    <w:lvl w:ilvl="6" w:tplc="240A000F" w:tentative="1">
+      <w:start w:val="1"/>
+      <w:numFmt w:val="decimal"/>
+      <w:lvlText w:val="%7."/>
+      <w:lvlJc w:val="left"/>
+      <w:pPr>
+        <w:ind w:left="5040" w:hanging="360"/>
+      </w:pPr>
+    </w:lvl>
+    <w:lvl w:ilvl="7" w:tplc="240A0019" w:tentative="1">
+      <w:start w:val="1"/>
+      <w:numFmt w:val="lowerLetter"/>
+      <w:lvlText w:val="%8."/>
+      <w:lvlJc w:val="left"/>
+      <w:pPr>
+        <w:ind w:left="5760" w:hanging="360"/>
+      </w:pPr>
+    </w:lvl>
+    <w:lvl w:ilvl="8" w:tplc="240A001B" w:tentative="1">
+      <w:start w:val="1"/>
+      <w:numFmt w:val="lowerRoman"/>
+      <w:lvlText w:val="%9."/>
+      <w:lvlJc w:val="right"/>
+      <w:pPr>
+        <w:ind w:left="6480" w:hanging="180"/>
+      </w:pPr>
+    </w:lvl>
+  </w:abstractNum>
+  <w:abstractNum w:abstractNumId="3" w15:restartNumberingAfterBreak="0">
     <w:nsid w:val="3A6324E4"/>
     <w:multiLevelType w:val="hybridMultilevel"/>
     <w:tmpl w:val="F4BA1558"/>
@@ -2893,7 +4027,7 @@
       </w:rPr>
     </w:lvl>
   </w:abstractNum>
-  <w:abstractNum w:abstractNumId="2" w15:restartNumberingAfterBreak="0">
+  <w:abstractNum w:abstractNumId="4" w15:restartNumberingAfterBreak="0">
     <w:nsid w:val="40E0251D"/>
     <w:multiLevelType w:val="hybridMultilevel"/>
     <w:tmpl w:val="EAE632D8"/>
@@ -3006,7 +4140,7 @@
       </w:rPr>
     </w:lvl>
   </w:abstractNum>
-  <w:abstractNum w:abstractNumId="3" w15:restartNumberingAfterBreak="0">
+  <w:abstractNum w:abstractNumId="5" w15:restartNumberingAfterBreak="0">
     <w:nsid w:val="4FA7126E"/>
     <w:multiLevelType w:val="hybridMultilevel"/>
     <w:tmpl w:val="62E2D29C"/>
@@ -3119,7 +4253,7 @@
       </w:rPr>
     </w:lvl>
   </w:abstractNum>
-  <w:abstractNum w:abstractNumId="4" w15:restartNumberingAfterBreak="0">
+  <w:abstractNum w:abstractNumId="6" w15:restartNumberingAfterBreak="0">
     <w:nsid w:val="5259754C"/>
     <w:multiLevelType w:val="hybridMultilevel"/>
     <w:tmpl w:val="804EA800"/>
@@ -3232,7 +4366,7 @@
       </w:rPr>
     </w:lvl>
   </w:abstractNum>
-  <w:abstractNum w:abstractNumId="5" w15:restartNumberingAfterBreak="0">
+  <w:abstractNum w:abstractNumId="7" w15:restartNumberingAfterBreak="0">
     <w:nsid w:val="52B824CC"/>
     <w:multiLevelType w:val="hybridMultilevel"/>
     <w:tmpl w:val="B7547F8E"/>
@@ -3345,7 +4479,7 @@
       </w:rPr>
     </w:lvl>
   </w:abstractNum>
-  <w:abstractNum w:abstractNumId="6" w15:restartNumberingAfterBreak="0">
+  <w:abstractNum w:abstractNumId="8" w15:restartNumberingAfterBreak="0">
     <w:nsid w:val="58AF0039"/>
     <w:multiLevelType w:val="hybridMultilevel"/>
     <w:tmpl w:val="C81A186A"/>
@@ -3458,7 +4592,7 @@
       </w:rPr>
     </w:lvl>
   </w:abstractNum>
-  <w:abstractNum w:abstractNumId="7" w15:restartNumberingAfterBreak="0">
+  <w:abstractNum w:abstractNumId="9" w15:restartNumberingAfterBreak="0">
     <w:nsid w:val="58C25367"/>
     <w:multiLevelType w:val="multilevel"/>
     <w:tmpl w:val="94A63992"/>
@@ -3583,7 +4717,7 @@
       </w:rPr>
     </w:lvl>
   </w:abstractNum>
-  <w:abstractNum w:abstractNumId="8" w15:restartNumberingAfterBreak="0">
+  <w:abstractNum w:abstractNumId="10" w15:restartNumberingAfterBreak="0">
     <w:nsid w:val="67DC3D51"/>
     <w:multiLevelType w:val="hybridMultilevel"/>
     <w:tmpl w:val="35183258"/>
@@ -3696,7 +4830,7 @@
       </w:rPr>
     </w:lvl>
   </w:abstractNum>
-  <w:abstractNum w:abstractNumId="9" w15:restartNumberingAfterBreak="0">
+  <w:abstractNum w:abstractNumId="11" w15:restartNumberingAfterBreak="0">
     <w:nsid w:val="72C07701"/>
     <w:multiLevelType w:val="hybridMultilevel"/>
     <w:tmpl w:val="06623BCA"/>
@@ -3809,7 +4943,7 @@
       </w:rPr>
     </w:lvl>
   </w:abstractNum>
-  <w:abstractNum w:abstractNumId="10" w15:restartNumberingAfterBreak="0">
+  <w:abstractNum w:abstractNumId="12" w15:restartNumberingAfterBreak="0">
     <w:nsid w:val="7AAC7309"/>
     <w:multiLevelType w:val="hybridMultilevel"/>
     <w:tmpl w:val="D936A2C8"/>
@@ -3819,7 +4953,7 @@
       <w:lvlText w:val="-"/>
       <w:lvlJc w:val="left"/>
       <w:pPr>
-        <w:ind w:left="2484" w:hanging="360"/>
+        <w:ind w:left="1920" w:hanging="360"/>
       </w:pPr>
       <w:rPr>
         <w:rFonts w:ascii="Arial" w:eastAsiaTheme="minorHAnsi" w:hAnsi="Arial" w:cs="Arial" w:hint="default"/>
@@ -3923,36 +5057,42 @@
     </w:lvl>
   </w:abstractNum>
   <w:num w:numId="1">
+    <w:abstractNumId w:val="8"/>
+  </w:num>
+  <w:num w:numId="2">
+    <w:abstractNumId w:val="1"/>
+  </w:num>
+  <w:num w:numId="3">
+    <w:abstractNumId w:val="9"/>
+  </w:num>
+  <w:num w:numId="4">
+    <w:abstractNumId w:val="11"/>
+  </w:num>
+  <w:num w:numId="5">
     <w:abstractNumId w:val="6"/>
   </w:num>
-  <w:num w:numId="2">
+  <w:num w:numId="6">
+    <w:abstractNumId w:val="10"/>
+  </w:num>
+  <w:num w:numId="7">
+    <w:abstractNumId w:val="3"/>
+  </w:num>
+  <w:num w:numId="8">
+    <w:abstractNumId w:val="7"/>
+  </w:num>
+  <w:num w:numId="9">
+    <w:abstractNumId w:val="5"/>
+  </w:num>
+  <w:num w:numId="10">
+    <w:abstractNumId w:val="12"/>
+  </w:num>
+  <w:num w:numId="11">
+    <w:abstractNumId w:val="4"/>
+  </w:num>
+  <w:num w:numId="12">
     <w:abstractNumId w:val="0"/>
   </w:num>
-  <w:num w:numId="3">
-    <w:abstractNumId w:val="7"/>
-  </w:num>
-  <w:num w:numId="4">
-    <w:abstractNumId w:val="9"/>
-  </w:num>
-  <w:num w:numId="5">
-    <w:abstractNumId w:val="4"/>
-  </w:num>
-  <w:num w:numId="6">
-    <w:abstractNumId w:val="8"/>
-  </w:num>
-  <w:num w:numId="7">
-    <w:abstractNumId w:val="1"/>
-  </w:num>
-  <w:num w:numId="8">
-    <w:abstractNumId w:val="5"/>
-  </w:num>
-  <w:num w:numId="9">
-    <w:abstractNumId w:val="3"/>
-  </w:num>
-  <w:num w:numId="10">
-    <w:abstractNumId w:val="10"/>
-  </w:num>
-  <w:num w:numId="11">
+  <w:num w:numId="13">
     <w:abstractNumId w:val="2"/>
   </w:num>
 </w:numbering>
@@ -4439,6 +5579,29 @@
     <w:uiPriority w:val="99"/>
     <w:rsid w:val="00D535E3"/>
   </w:style>
+  <w:style w:type="character" w:styleId="Hipervnculo">
+    <w:name w:val="Hyperlink"/>
+    <w:basedOn w:val="Fuentedeprrafopredeter"/>
+    <w:uiPriority w:val="99"/>
+    <w:unhideWhenUsed/>
+    <w:rsid w:val="00C42BBD"/>
+    <w:rPr>
+      <w:color w:val="0563C1" w:themeColor="hyperlink"/>
+      <w:u w:val="single"/>
+    </w:rPr>
+  </w:style>
+  <w:style w:type="character" w:styleId="Mencinsinresolver">
+    <w:name w:val="Unresolved Mention"/>
+    <w:basedOn w:val="Fuentedeprrafopredeter"/>
+    <w:uiPriority w:val="99"/>
+    <w:semiHidden/>
+    <w:unhideWhenUsed/>
+    <w:rsid w:val="00C42BBD"/>
+    <w:rPr>
+      <w:color w:val="605E5C"/>
+      <w:shd w:val="clear" w:color="auto" w:fill="E1DFDD"/>
+    </w:rPr>
+  </w:style>
 </w:styles>
 </file>
 

</xml_diff>